<commit_message>
Add Reproducibility statement (for reviewers/citers): deterministic harness, Colab, traceable figure data
</commit_message>
<xml_diff>
--- a/paper/KV Cache Compression_paper_revised.docx
+++ b/paper/KV Cache Compression_paper_revised.docx
@@ -5873,6 +5873,20 @@
       </w:r>
       <w:r>
         <w:t>No new datasets were generated. The Matched-Budget Evaluation (MBE) protocol specification, the open evaluation harness, the KV Compression Card template, and the seed reference results described in Section 10 are released in a public repository at https://github.com/rohithreddybc/mbe-protocol, with the evaluation manifest and reference cards also published as a dataset at https://huggingface.co/datasets/Rohithreddybc/mbe-kv-cache and a live leaderboard at https://huggingface.co/spaces/Rohithreddybc/mbe-leaderboard; all other works discussed are cited and publicly available.</w:t>
+      </w:r>
+    </w:p>
+    <w:p>
+      <w:pPr>
+        <w:jc w:val="both"/>
+      </w:pPr>
+      <w:r>
+        <w:rPr>
+          <w:b/>
+        </w:rPr>
+        <w:t xml:space="preserve">Reproducibility. </w:t>
+      </w:r>
+      <w:r>
+        <w:t>All claims in this survey cite publicly available works. The empirical results of Section 10 are reproducible by third parties: the released harness regenerates the reported seed results deterministically (fixed random seed), and any researcher can evaluate a new compression method, or reproduce the baselines at 7-8B scale on free cloud hardware, by supplying a single function to the provided notebook. The data behind the figures is traceable to the cited sources, and the reference list is the single source of truth for all citations.</w:t>
       </w:r>
     </w:p>
     <w:p>

</xml_diff>

<commit_message>
Add a Takeaway to every figure and table caption; remove name from author list (Author 1 placeholder)
</commit_message>
<xml_diff>
--- a/paper/KV Cache Compression_paper_revised.docx
+++ b/paper/KV Cache Compression_paper_revised.docx
@@ -23,7 +23,7 @@
           <w:i w:val="0"/>
           <w:sz w:val="24"/>
         </w:rPr>
-        <w:t>Rohith Reddy B. C.¹  ·  [Author 2]²  ·  [Author 3]³  ·  [Author 4]⁴</w:t>
+        <w:t>[Author 1]¹  ·  [Author 2]²  ·  [Author 3]³  ·  [Author 4]⁴</w:t>
       </w:r>
     </w:p>
     <w:p>
@@ -49,7 +49,7 @@
           <w:i/>
           <w:sz w:val="20"/>
         </w:rPr>
-        <w:t>Corresponding author: Rohith Reddy B. C., rohithreddybc98@gmail.com  ·  ORCID: [add ORCID for each author]</w:t>
+        <w:t>Corresponding author: [name], [email]  ·  ORCID: [add ORCID for each author]</w:t>
       </w:r>
     </w:p>
     <w:p/>
@@ -235,7 +235,7 @@
           <w:b/>
           <w:sz w:val="20"/>
         </w:rPr>
-        <w:t>Table 1. Positioning of this survey against existing reviews of KV cache and inference efficiency. No prior survey jointly covers multi-tenant security and agentic degradation, and none proposes a standardised evaluation protocol (the right-most column).</w:t>
+        <w:t>Table 1. Positioning of this survey against existing reviews of KV cache and inference efficiency. No prior survey jointly covers multi-tenant security and agentic degradation, and none proposes a standardised evaluation protocol (the right-most column). Takeaway: this survey occupies an unfilled niche, defined by the security, agentic, and evaluation-protocol columns that are empty for every other entry.</w:t>
       </w:r>
     </w:p>
     <w:tbl>
@@ -1375,7 +1375,7 @@
           <w:b/>
           <w:sz w:val="18"/>
         </w:rPr>
-        <w:t>Fig. 1. PRISMA-style flow of identification, screening, and inclusion for the survey (counts approximate).</w:t>
+        <w:t>Fig. 1. PRISMA-style flow of identification, screening, and inclusion for the survey (counts approximate). Takeaway: coverage is reproducible and selective, 178 KV-cache works analysed in depth out of roughly 612 screened.</w:t>
       </w:r>
     </w:p>
     <w:p>
@@ -1450,7 +1450,7 @@
           <w:b/>
           <w:sz w:val="18"/>
         </w:rPr>
-        <w:t>Fig. 2. Four-layer taxonomy of KV cache optimisation used in this survey, with the cross-cutting concerns of Sections 8 and 9.</w:t>
+        <w:t>Fig. 2. Four-layer taxonomy of KV cache optimisation used in this survey, with the cross-cutting concerns of Sections 8 and 9. Takeaway: the four layers are complementary rather than competing, and the largest gains come from co-designing across them.</w:t>
       </w:r>
     </w:p>
     <w:p>
@@ -2151,7 +2151,7 @@
           <w:b/>
           <w:sz w:val="20"/>
         </w:rPr>
-        <w:t>Table 2. Reported KV cache security threats in multi-tenant serving and their mitigations (Wu et al. 2025; Song et al. 2024; Gu et al. 2025; Luo et al. 2025; Pang et al. 2024; Chu et al. 2025).</w:t>
+        <w:t>Table 2. Reported KV cache security threats in multi-tenant serving and their mitigations (Wu et al. 2025; Song et al. 2024; Gu et al. 2025; Luo et al. 2025; Pang et al. 2024; Chu et al. 2025). Takeaway: the same prefix sharing that drives efficiency is the attack surface, and every known mitigation trades some of that efficiency back for isolation.</w:t>
       </w:r>
     </w:p>
     <w:tbl>
@@ -2609,7 +2609,7 @@
           <w:b/>
           <w:sz w:val="20"/>
         </w:rPr>
-        <w:t>Table 3. Taxonomy of KV cache optimisation families. Reduction figures are indicative ranges from the cited literature.</w:t>
+        <w:t>Table 3. Taxonomy of KV cache optimisation families. Reduction figures are indicative ranges from the cited literature. Takeaway: architectural, system, and hardware methods are lossless but need pre-training or special hardware, whereas algorithmic methods are training-free but trade accuracy for higher compression; the column to optimise is set by the deployment's hardware bottleneck.</w:t>
       </w:r>
     </w:p>
     <w:tbl>
@@ -3459,7 +3459,7 @@
           <w:b/>
           <w:sz w:val="20"/>
         </w:rPr>
-        <w:t>Table 4. Representative methods and author-reported results. Settings differ and the figures are not directly comparable (see Section 9.3).</w:t>
+        <w:t>Table 4. Representative methods and author-reported results. Settings differ and the figures are not directly comparable (see Section 9.3). Takeaway: headline gains are large across the board (2-5x compression or throughput at near-lossless quality), but because each is measured differently they cannot be ranked, which is exactly the gap MBE closes.</w:t>
       </w:r>
     </w:p>
     <w:tbl>
@@ -4137,7 +4137,7 @@
           <w:b/>
           <w:sz w:val="20"/>
         </w:rPr>
-        <w:t>Table 5. Author-reported accuracy retention at a stated KV budget, collated from the cited works. Settings differ; not a controlled comparison (cf. the MBE protocol, Section 10).</w:t>
+        <w:t>Table 5. Author-reported accuracy retention at a stated KV budget, collated from the cited works. Settings differ; not a controlled comparison (cf. the MBE protocol, Section 10). Takeaway: most methods hold near-full accuracy down to roughly 10-25 percent of the cache, and the aggressive frontier (a few percent) is reached mainly by layer-adaptive and learned methods.</w:t>
       </w:r>
     </w:p>
     <w:tbl>
@@ -5013,7 +5013,7 @@
           <w:b/>
           <w:sz w:val="18"/>
         </w:rPr>
-        <w:t>Fig. 3. Surveyed references by publication year and method family (approximate single-family assignment from the reference corpus).</w:t>
+        <w:t>Fig. 3. Surveyed references by publication year and method family (approximate single-family assignment from the reference corpus). Takeaway: the field expanded sharply in 2024 and stays active into 2025-2026, and the security and agentic categories appear only in the latest years, marking them as emerging and under-surveyed.</w:t>
       </w:r>
     </w:p>
     <w:p>
@@ -5104,7 +5104,7 @@
           <w:b/>
           <w:sz w:val="18"/>
         </w:rPr>
-        <w:t>Fig. 4. Memory-accuracy frontier plotted from author-reported points (Table 5). Settings differ across papers, so positions are indicative, not a controlled comparison; the MBE harness (Section 10) produces the controlled version.</w:t>
+        <w:t>Fig. 4. Memory-accuracy frontier plotted from author-reported points (Table 5). Settings differ across papers, so positions are indicative, not a controlled comparison; the MBE harness (Section 10) produces the controlled version. Takeaway: accuracy holds remarkably flat until very aggressive budgets, where a sharp knee appears, and the position of that knee is what the right method, and a matched-budget comparison, decides.</w:t>
       </w:r>
     </w:p>
     <w:p>
@@ -5261,7 +5261,7 @@
           <w:b/>
           <w:sz w:val="20"/>
         </w:rPr>
-        <w:t>Table 6. The Matched-Budget Evaluation (MBE) reporting specification. Methods report the task-accuracy grid and system metrics at each fixed budget.</w:t>
+        <w:t>Table 6. The Matched-Budget Evaluation (MBE) reporting specification. Methods report the task-accuracy grid and system metrics at each fixed budget. Takeaway: fixing the model, task, budget ladder, and system metrics is all that is needed to turn the incomparable numbers of Tables 4 and 5 into a single comparable picture.</w:t>
       </w:r>
     </w:p>
     <w:tbl>
@@ -5914,7 +5914,7 @@
         <w:t xml:space="preserve">Author contributions. </w:t>
       </w:r>
       <w:r>
-        <w:t>All authors contributed to the conception and design of the survey and approved the final manuscript. [Assign CRediT roles per author, e.g.: R.R.B.C. - Conceptualization, Investigation, Software (the MBE harness), Visualization, Writing - original draft; Author 2 - Investigation, Writing - review &amp; editing; Author 3 - Investigation, Validation; Author 4 - Supervision, Writing - review &amp; editing.]</w:t>
+        <w:t>All authors contributed to the conception and design of the survey and approved the final manuscript. [Assign CRediT roles per author, e.g.: Author 1 - Conceptualization, Investigation, Software (the MBE harness), Visualization, Writing - original draft; Author 2 - Investigation, Writing - review &amp; editing; Author 3 - Investigation, Validation; Author 4 - Supervision, Writing - review &amp; editing.]</w:t>
       </w:r>
     </w:p>
     <w:p>

</xml_diff>